<commit_message>
Update launch notes with origin story and neurodivergent focus
- Rewrote launch note to center the origin story: eldest child saying 'Baajit' instead of 'rabbit'
- Added AUDHD context to establish why app was built
- Changed all references from 'ADHD' to 'neurodivergent' throughout to reflect broader audience
- Updated feature explanations to emphasize neurodivergent challenges (sensory overwhelm, executive dysfunction, rejection sensitivity, time blindness)
- Clarified open-source philosophy: free because neurodivergent people often can't afford subscriptions
- Updated all app references from 'Nibble' to 'Baajit'
- Maintained warm, personal tone that speaks directly to neurodivergent audience
- Word document synced with markdown version

Co-Authored-By: Claude Haiku 4.5 <noreply@anthropic.com>
</commit_message>
<xml_diff>
--- a/play-store/Baajit_Launch_Note.docx
+++ b/play-store/Baajit_Launch_Note.docx
@@ -8,7 +8,7 @@
         <w:jc w:val="center"/>
       </w:pPr>
       <w:r>
-        <w:t>Why I Built Nibble</w:t>
+        <w:t>Why I Built Baajit — And Why It's for Neurodivergent Minds</w:t>
       </w:r>
     </w:p>
     <w:p>
@@ -23,7 +23,7 @@
           <w:color w:val="666666"/>
           <w:sz w:val="28"/>
         </w:rPr>
-        <w:t>And Why I'm Giving It Away</w:t>
+        <w:t>The Origin</w:t>
       </w:r>
     </w:p>
     <w:p>
@@ -69,7 +69,25 @@
     </w:p>
     <w:p>
       <w:r>
-        <w:t>I have ADHD. If you're reading this, there's a good chance you do too — or you love someone who does.</w:t>
+        <w:t>My eldest child used to say “Baajit” instead of “rabbit” when they were small. It stuck with me — that word, that voice, the way a kid’s pronunciation becomes its own thing entirely. Years later, I learned they have ADHD. And I was diagnosed with AUDHD as an adult.</w:t>
+      </w:r>
+    </w:p>
+    <w:p>
+      <w:r>
+        <w:t>That’s where the name comes from. And that’s why this app exists.</w:t>
+      </w:r>
+    </w:p>
+    <w:p>
+      <w:pPr>
+        <w:pStyle w:val="Heading2"/>
+      </w:pPr>
+      <w:r>
+        <w:t>The Problem Nobody Was Solving</w:t>
+      </w:r>
+    </w:p>
+    <w:p>
+      <w:r>
+        <w:t>I have ADHD. I’m also autistic. If you’re reading this, there’s a good chance you’re neurodivergent too — or you love someone who is.</w:t>
       </w:r>
     </w:p>
     <w:p>
@@ -83,21 +101,13 @@
       </w:r>
     </w:p>
     <w:p>
-      <w:pPr>
-        <w:pStyle w:val="Heading2"/>
-      </w:pPr>
-      <w:r>
-        <w:t>The Problem Nobody Was Solving</w:t>
-      </w:r>
-    </w:p>
-    <w:p>
       <w:r>
         <w:t>Most productivity tools are designed around a single assumption: that the hard part is knowing what to do. Make a list, prioritize it, work through it. Simple.</w:t>
       </w:r>
     </w:p>
     <w:p>
       <w:r>
-        <w:t>But when you have ADHD, knowing what to do was never the problem. The problem is the space between knowing and doing. It's the task that feels so enormous you can't start it. It's finishing one thing and getting stuck instead of moving to the next. It's having a burst of energy at 10pm and nothing left at 2pm when the actual work needs to happen. It's the racing thoughts that won't quiet down long enough for you to focus on any single one of them.</w:t>
+        <w:t>But when you’re neurodivergent, knowing what to do was never the problem. The problem is the space between knowing and doing. It’s the task that feels so enormous you can’t start it. It’s finishing one thing and getting stuck instead of moving to the next. It’s having a burst of energy at 10pm and nothing left at 2pm when the actual work needs to happen. It’s the racing thoughts that won’t quiet down long enough for you to focus on any single one of them. It’s sensory overwhelm, executive dysfunction, rejection sensitivity, time blindness, and a hundred other things that neurotypical systems just don’t account for.</w:t>
       </w:r>
     </w:p>
     <w:p>
@@ -110,12 +120,12 @@
         <w:pStyle w:val="Heading2"/>
       </w:pPr>
       <w:r>
-        <w:t>So I Built Nibble</w:t>
+        <w:t>So I Built Baajit</w:t>
       </w:r>
     </w:p>
     <w:p>
       <w:r>
-        <w:t>Nibble is a task and habit manager, yes. But every feature in it exists because of a specific ADHD challenge I've lived with.</w:t>
+        <w:t>Baajit is a task and habit manager, yes. But every feature in it exists because of a specific challenge I’ve lived with as a neurodivergent person.</w:t>
       </w:r>
     </w:p>
     <w:p>
@@ -127,7 +137,7 @@
         <w:t>Energy tracking</w:t>
       </w:r>
       <w:r>
-        <w:t xml:space="preserve"> exists because my capacity changes dramatically from day to day — sometimes hour to hour. On a depleted morning, showing me my full task list isn't helpful. It's paralyzing. Nibble asks how I'm feeling and adjusts accordingly.</w:t>
+        <w:t xml:space="preserve"> exists because my capacity changes dramatically from day to day — sometimes hour to hour. On a depleted morning, showing me my full task list isn’t helpful. It’s paralyzing. Baajit asks how I’m feeling and adjusts accordingly.</w:t>
       </w:r>
     </w:p>
     <w:p>
@@ -139,7 +149,7 @@
         <w:t>Task breakdown</w:t>
       </w:r>
       <w:r>
-        <w:t xml:space="preserve"> exists because "write the report" isn't a task when you have ADHD. It's a wall. Nibble lets me crack it into tiny pieces — "open the document," "write the first sentence," "find that one statistic" — and suddenly the wall has handholds.</w:t>
+        <w:t xml:space="preserve"> exists because “write the report” isn’t a task when you have ADHD. It’s a wall. Baajit lets me crack it into tiny pieces — “open the document,” “write the first sentence,” “find that one statistic” — and suddenly the wall has handholds.</w:t>
       </w:r>
     </w:p>
     <w:p>
@@ -151,7 +161,7 @@
         <w:t>Transition prompts</w:t>
       </w:r>
       <w:r>
-        <w:t xml:space="preserve"> exist because one of the hardest parts of ADHD that nobody talks about is the space between tasks. I finish something and instead of moving on, I freeze. Or I spiral into my phone for forty minutes. Nibble's rabbit gives me a gentle nudge — just enough to bridge the gap.</w:t>
+        <w:t xml:space="preserve"> exist because one of the hardest parts of neurodivergence that nobody talks about is the space between tasks. I finish something and instead of moving on, I freeze. Or I spiral into my phone for forty minutes. Baajit’s rabbit gives me a gentle nudge — just enough to bridge the gap.</w:t>
       </w:r>
     </w:p>
     <w:p>
@@ -163,7 +173,7 @@
         <w:t>Grounding exercises</w:t>
       </w:r>
       <w:r>
-        <w:t xml:space="preserve"> exist because sometimes my brain isn't in a state where productivity is even possible. Before I can do the work, I need to come back to my body. Box breathing, the 5-4-3-2-1 technique, a quick body scan — they're always one tap away.</w:t>
+        <w:t xml:space="preserve"> exist because sometimes my brain isn’t in a state where productivity is even possible. Before I can do the work, I need to come back to my body. Box breathing, the 5-4-3-2-1 technique, a quick body scan — they’re always one tap away.</w:t>
       </w:r>
     </w:p>
     <w:p>
@@ -187,7 +197,7 @@
         <w:t>The rabbit</w:t>
       </w:r>
       <w:r>
-        <w:t xml:space="preserve"> exists because shame doesn't motivate ADHD brains. Guilt doesn't either. But a small companion that's happy to see you, that grows with you, that celebrates when you show up — that works. The rabbit never judges you for missing a day. It just waits for you to come back.</w:t>
+        <w:t xml:space="preserve"> exists because shame doesn’t motivate neurodivergent brains. Guilt doesn’t either. But a small companion that’s happy to see you, that grows with you, that celebrates when you show up — that works. The rabbit never judges you for missing a day. It just waits for you to come back.</w:t>
       </w:r>
     </w:p>
     <w:p>
@@ -200,7 +210,7 @@
     </w:p>
     <w:p>
       <w:r>
-        <w:t>I'm not a developer by trade. I'm a writer. I built Nibble because I needed it, and I learned to code along the way because nobody else was building what I needed.</w:t>
+        <w:t>I’m not a developer by trade. I’m a writer. I built Baajit because I needed it, and I learned to code along the way because nobody else was building what I needed.</w:t>
       </w:r>
     </w:p>
     <w:p>
@@ -210,17 +220,17 @@
     </w:p>
     <w:p>
       <w:r>
-        <w:t>ADHD apps shouldn't be locked behind subscriptions. The people who need them most — the ones whose ADHD makes it hard to hold a steady job, manage money, maintain routines — are often the ones who can't afford another $9.99 per month. Nibble is free. No premium tier, no trial period, no "upgrade to unlock."</w:t>
+        <w:t>Apps for neurodivergent people shouldn’t be locked behind subscriptions. The people who need them most — the ones whose ADHD or autism makes it hard to hold a steady job, manage money, maintain routines — are often the ones who can’t afford another $9.99 per month. Baajit is free. No premium tier, no trial period, no “upgrade to unlock.”</w:t>
       </w:r>
     </w:p>
     <w:p>
       <w:r>
-        <w:t>Your data should stay yours. Nibble stores everything on your device. No accounts, no cloud sync, no analytics. Your mood logs, your energy patterns, your brain dumps — that's intimate information. It shouldn't live on someone else's server.</w:t>
+        <w:t>Your data should stay yours. Baajit stores everything on your device. No accounts, no cloud sync, no analytics. Your mood logs, your energy patterns, your brain dumps — that’s intimate information. It shouldn’t live on someone else’s server.</w:t>
       </w:r>
     </w:p>
     <w:p>
       <w:r>
-        <w:t>And honestly, I know Nibble isn't perfect. It's the app I needed, but ADHD looks different for everyone. By making the code open, I'm inviting people who understand this problem — people who live it — to make Nibble better in ways I haven't thought of. If you have an idea for a feature that would help you, you can build it. Or tell someone who can.</w:t>
+        <w:t>And honestly, I know Baajit isn’t perfect. It’s the app I needed, but neurodivergence looks different for everyone. By making the code open, I’m inviting people who understand this problem — people who live it — to make Baajit better in ways I haven’t thought of. If you have an idea for a feature that would help you, you can build it. Or tell someone who can.</w:t>
       </w:r>
     </w:p>
     <w:p>
@@ -233,7 +243,7 @@
     </w:p>
     <w:p>
       <w:r>
-        <w:t>I want to be careful here. Nibble isn't going to cure ADHD. It's not therapy, it's not medication, it's not a replacement for professional support.</w:t>
+        <w:t>I want to be careful here. Baajit isn’t going to cure ADHD, autism, or any neurodivergent condition. It’s not therapy, it’s not medication, it’s not a replacement for professional support.</w:t>
       </w:r>
     </w:p>
     <w:p>
@@ -243,12 +253,12 @@
     </w:p>
     <w:p>
       <w:r>
-        <w:t>When I check my energy level in the morning and Nibble shows me a shorter, gentler list instead of everything I'm behind on — that's one less moment of overwhelm. When I break a scary task into five small ones and actually start — that's momentum I didn't have before. When I finish something and the rabbit gives me a little nudge forward instead of letting me drift — that's a transition I might have lost twenty minutes to.</w:t>
+        <w:t>When I check my energy level in the morning and Baajit shows me a shorter, gentler list instead of everything I’m behind on — that’s one less moment of overwhelm. When I break a scary task into five small ones and actually start — that’s momentum I didn’t have before. When I finish something and the rabbit gives me a little nudge forward instead of letting me drift — that’s a transition I might have lost twenty minutes to.</w:t>
       </w:r>
     </w:p>
     <w:p>
       <w:r>
-        <w:t>These are small things. But ADHD is a condition of small moments. The moment you lose focus. The moment you can't start. The moment between tasks when everything stalls. If an app can make even some of those moments a little easier, that adds up to a meaningfully different day. And enough different days add up to a different life.</w:t>
+        <w:t>These are small things. But neurodivergence is a condition of small moments. The moment you lose focus. The moment you can’t start. The moment between tasks when everything stalls. The moment when everything is too much and you need to ground. If an app can make even some of those moments a little easier, that adds up to a meaningfully different day. And enough different days add up to a different life.</w:t>
       </w:r>
     </w:p>
     <w:p>
@@ -261,7 +271,7 @@
     </w:p>
     <w:p>
       <w:r>
-        <w:t>Nibble is at v1.0.0. It has tasks, habits, mood tracking, energy check-ins, a focus timer, brain dump, grounding exercises, transition prompts, and a rabbit that grows with you. It runs on desktop and will be on Android soon.</w:t>
+        <w:t>Baajit is at v1.0.0. It has tasks, habits, mood tracking, energy check-ins, a focus timer, brain dump, grounding exercises, transition prompts, and a rabbit that grows with you. It runs on desktop and will be on Android soon.</w:t>
       </w:r>
     </w:p>
     <w:p>
@@ -271,7 +281,7 @@
     </w:p>
     <w:p>
       <w:r>
-        <w:t>If you have ADHD and you've been looking for something that gets it — try Nibble. If it helps, tell someone. If it could be better, tell me. And if you want to build on it, the code is yours.</w:t>
+        <w:t>If you’re neurodivergent and you’ve been looking for something that gets it — try Baajit. If it helps, tell someone. If it could be better, tell me. And if you want to build on it, the code is yours.</w:t>
       </w:r>
     </w:p>
     <w:p>
@@ -308,7 +318,7 @@
         <w:pStyle w:val="Heading1"/>
       </w:pPr>
       <w:r>
-        <w:t>Nibble v1.0.0 — Feature Overview</w:t>
+        <w:t>Baajit v1.0.0 — Feature Overview</w:t>
       </w:r>
     </w:p>
     <w:p>
@@ -488,7 +498,7 @@
         <w:t>12. Welcome Experience</w:t>
       </w:r>
       <w:r>
-        <w:t xml:space="preserve"> — First-launch onboarding with an illustrated carrot field scene introducing your rabbit companion.</w:t>
+        <w:t xml:space="preserve"> — First-launch onboarding with a carrot field photograph and your rabbit companion introducing how Baajit works.</w:t>
       </w:r>
     </w:p>
     <w:p>

</xml_diff>